<commit_message>
Add author names to every heading in 4.3 report
Co-Authored-By: Claude Opus 5.5 <noreply@anthropic.com>
Claude-Session: https://claude.ai/code/session_01Kk2nfkPg9B6EJa48cu7SnH
</commit_message>
<xml_diff>
--- a/TI3002C_Etapa_4.3_6.docx
+++ b/TI3002C_Etapa_4.3_6.docx
@@ -200,7 +200,19 @@
         <w:spacing w:after="100" w:before="240"/>
       </w:pPr>
       <w:r>
-        <w:t xml:space="preserve">Bases de datos y variables analizadas</w:t>
+        <w:t xml:space="preserve">Bases de datos y variables analizadas (</w:t>
+      </w:r>
+      <w:r>
+        <w:rPr>
+          <w:b/>
+          <w:bCs/>
+          <w:highlight w:val="yellow"/>
+          <w:highlightCs w:val="yellow"/>
+        </w:rPr>
+        <w:t xml:space="preserve">Jaime</w:t>
+      </w:r>
+      <w:r>
+        <w:t xml:space="preserve">)</w:t>
       </w:r>
     </w:p>
     <w:p>
@@ -724,6 +736,27 @@
       </w:pPr>
       <w:r>
         <w:t xml:space="preserve">1.1 Nivel Micro (Diario) (</w:t>
+      </w:r>
+      <w:r>
+        <w:rPr>
+          <w:b/>
+          <w:bCs/>
+          <w:highlight w:val="yellow"/>
+          <w:highlightCs w:val="yellow"/>
+        </w:rPr>
+        <w:t xml:space="preserve">Aldahir</w:t>
+      </w:r>
+      <w:r>
+        <w:t xml:space="preserve">)</w:t>
+      </w:r>
+    </w:p>
+    <w:p>
+      <w:pPr>
+        <w:pStyle w:val="Heading3"/>
+        <w:spacing w:after="100" w:before="160"/>
+      </w:pPr>
+      <w:r>
+        <w:t xml:space="preserve">1.1.1 Correlación de Pearson – Nivel Micro (</w:t>
       </w:r>
       <w:r>
         <w:rPr>
@@ -802,6 +835,27 @@
     </w:p>
     <w:p>
       <w:pPr>
+        <w:pStyle w:val="Heading3"/>
+        <w:spacing w:after="100" w:before="160"/>
+      </w:pPr>
+      <w:r>
+        <w:t xml:space="preserve">1.1.2 Correlación de Spearman – Nivel Micro (</w:t>
+      </w:r>
+      <w:r>
+        <w:rPr>
+          <w:b/>
+          <w:bCs/>
+          <w:highlight w:val="yellow"/>
+          <w:highlightCs w:val="yellow"/>
+        </w:rPr>
+        <w:t xml:space="preserve">Aldahir</w:t>
+      </w:r>
+      <w:r>
+        <w:t xml:space="preserve">)</w:t>
+      </w:r>
+    </w:p>
+    <w:p>
+      <w:pPr>
         <w:keepNext/>
         <w:spacing w:before="120"/>
         <w:jc w:val="center"/>
@@ -864,6 +918,27 @@
     </w:p>
     <w:p>
       <w:pPr>
+        <w:pStyle w:val="Heading3"/>
+        <w:spacing w:after="100" w:before="160"/>
+      </w:pPr>
+      <w:r>
+        <w:t xml:space="preserve">1.1.3 Correlación de Kendall – Nivel Micro (</w:t>
+      </w:r>
+      <w:r>
+        <w:rPr>
+          <w:b/>
+          <w:bCs/>
+          <w:highlight w:val="yellow"/>
+          <w:highlightCs w:val="yellow"/>
+        </w:rPr>
+        <w:t xml:space="preserve">Aldahir</w:t>
+      </w:r>
+      <w:r>
+        <w:t xml:space="preserve">)</w:t>
+      </w:r>
+    </w:p>
+    <w:p>
+      <w:pPr>
         <w:keepNext/>
         <w:spacing w:before="120"/>
         <w:jc w:val="center"/>
@@ -926,6 +1001,27 @@
     </w:p>
     <w:p>
       <w:pPr>
+        <w:pStyle w:val="Heading3"/>
+        <w:spacing w:after="100" w:before="160"/>
+      </w:pPr>
+      <w:r>
+        <w:t xml:space="preserve">1.1.4 Análisis – Nivel Micro (</w:t>
+      </w:r>
+      <w:r>
+        <w:rPr>
+          <w:b/>
+          <w:bCs/>
+          <w:highlight w:val="yellow"/>
+          <w:highlightCs w:val="yellow"/>
+        </w:rPr>
+        <w:t xml:space="preserve">Aldahir</w:t>
+      </w:r>
+      <w:r>
+        <w:t xml:space="preserve">)</w:t>
+      </w:r>
+    </w:p>
+    <w:p>
+      <w:pPr>
         <w:spacing w:after="120"/>
       </w:pPr>
       <w:r>
@@ -1044,6 +1140,27 @@
       </w:pPr>
       <w:r>
         <w:t xml:space="preserve">1.2 Nivel Macro (Mensual) (</w:t>
+      </w:r>
+      <w:r>
+        <w:rPr>
+          <w:b/>
+          <w:bCs/>
+          <w:highlight w:val="yellow"/>
+          <w:highlightCs w:val="yellow"/>
+        </w:rPr>
+        <w:t xml:space="preserve">Javier</w:t>
+      </w:r>
+      <w:r>
+        <w:t xml:space="preserve">)</w:t>
+      </w:r>
+    </w:p>
+    <w:p>
+      <w:pPr>
+        <w:pStyle w:val="Heading3"/>
+        <w:spacing w:after="100" w:before="160"/>
+      </w:pPr>
+      <w:r>
+        <w:t xml:space="preserve">1.2.1 Correlación de Pearson – Nivel Macro (</w:t>
       </w:r>
       <w:r>
         <w:rPr>
@@ -1122,6 +1239,27 @@
     </w:p>
     <w:p>
       <w:pPr>
+        <w:pStyle w:val="Heading3"/>
+        <w:spacing w:after="100" w:before="160"/>
+      </w:pPr>
+      <w:r>
+        <w:t xml:space="preserve">1.2.2 Correlación de Spearman – Nivel Macro (</w:t>
+      </w:r>
+      <w:r>
+        <w:rPr>
+          <w:b/>
+          <w:bCs/>
+          <w:highlight w:val="yellow"/>
+          <w:highlightCs w:val="yellow"/>
+        </w:rPr>
+        <w:t xml:space="preserve">Javier</w:t>
+      </w:r>
+      <w:r>
+        <w:t xml:space="preserve">)</w:t>
+      </w:r>
+    </w:p>
+    <w:p>
+      <w:pPr>
         <w:keepNext/>
         <w:spacing w:before="120"/>
         <w:jc w:val="center"/>
@@ -1184,6 +1322,27 @@
     </w:p>
     <w:p>
       <w:pPr>
+        <w:pStyle w:val="Heading3"/>
+        <w:spacing w:after="100" w:before="160"/>
+      </w:pPr>
+      <w:r>
+        <w:t xml:space="preserve">1.2.3 Correlación de Kendall – Nivel Macro (</w:t>
+      </w:r>
+      <w:r>
+        <w:rPr>
+          <w:b/>
+          <w:bCs/>
+          <w:highlight w:val="yellow"/>
+          <w:highlightCs w:val="yellow"/>
+        </w:rPr>
+        <w:t xml:space="preserve">Javier</w:t>
+      </w:r>
+      <w:r>
+        <w:t xml:space="preserve">)</w:t>
+      </w:r>
+    </w:p>
+    <w:p>
+      <w:pPr>
         <w:keepNext/>
         <w:spacing w:before="120"/>
         <w:jc w:val="center"/>
@@ -1246,6 +1405,27 @@
     </w:p>
     <w:p>
       <w:pPr>
+        <w:pStyle w:val="Heading3"/>
+        <w:spacing w:after="100" w:before="160"/>
+      </w:pPr>
+      <w:r>
+        <w:t xml:space="preserve">1.2.4 Análisis – Nivel Macro (</w:t>
+      </w:r>
+      <w:r>
+        <w:rPr>
+          <w:b/>
+          <w:bCs/>
+          <w:highlight w:val="yellow"/>
+          <w:highlightCs w:val="yellow"/>
+        </w:rPr>
+        <w:t xml:space="preserve">Javier</w:t>
+      </w:r>
+      <w:r>
+        <w:t xml:space="preserve">)</w:t>
+      </w:r>
+    </w:p>
+    <w:p>
+      <w:pPr>
         <w:spacing w:after="120"/>
       </w:pPr>
       <w:r>
@@ -7133,7 +7313,7 @@
         <w:spacing w:after="100" w:before="240"/>
       </w:pPr>
       <w:r>
-        <w:t xml:space="preserve">2. ANOVA y T-test (</w:t>
+        <w:t xml:space="preserve">2. Análisis ANOVA y T-test (</w:t>
       </w:r>
       <w:r>
         <w:rPr>
@@ -7154,7 +7334,19 @@
         <w:spacing w:after="100" w:before="160"/>
       </w:pPr>
       <w:r>
-        <w:t xml:space="preserve">2.1 Método</w:t>
+        <w:t xml:space="preserve">2.1 Método (</w:t>
+      </w:r>
+      <w:r>
+        <w:rPr>
+          <w:b/>
+          <w:bCs/>
+          <w:highlight w:val="yellow"/>
+          <w:highlightCs w:val="yellow"/>
+        </w:rPr>
+        <w:t xml:space="preserve">Felix</w:t>
+      </w:r>
+      <w:r>
+        <w:t xml:space="preserve">)</w:t>
       </w:r>
     </w:p>
     <w:p>
@@ -7314,7 +7506,19 @@
         <w:spacing w:after="100" w:before="160"/>
       </w:pPr>
       <w:r>
-        <w:t xml:space="preserve">2.2 Pruebas de hipótesis de la problemática</w:t>
+        <w:t xml:space="preserve">2.2 Pruebas de hipótesis de la problemática (</w:t>
+      </w:r>
+      <w:r>
+        <w:rPr>
+          <w:b/>
+          <w:bCs/>
+          <w:highlight w:val="yellow"/>
+          <w:highlightCs w:val="yellow"/>
+        </w:rPr>
+        <w:t xml:space="preserve">Felix</w:t>
+      </w:r>
+      <w:r>
+        <w:t xml:space="preserve">)</w:t>
       </w:r>
     </w:p>
     <w:p>
@@ -9534,7 +9738,19 @@
         <w:spacing w:after="100" w:before="160"/>
       </w:pPr>
       <w:r>
-        <w:t xml:space="preserve">2.3 Resultados de todas las variables</w:t>
+        <w:t xml:space="preserve">2.3 Resultados de todas las variables (</w:t>
+      </w:r>
+      <w:r>
+        <w:rPr>
+          <w:b/>
+          <w:bCs/>
+          <w:highlight w:val="yellow"/>
+          <w:highlightCs w:val="yellow"/>
+        </w:rPr>
+        <w:t xml:space="preserve">Felix</w:t>
+      </w:r>
+      <w:r>
+        <w:t xml:space="preserve">)</w:t>
       </w:r>
     </w:p>
     <w:p>
@@ -15962,7 +16178,19 @@
         <w:spacing w:after="100" w:before="160"/>
       </w:pPr>
       <w:r>
-        <w:t xml:space="preserve">2.4 Análisis de ANOVA y T-test</w:t>
+        <w:t xml:space="preserve">2.4 Análisis de ANOVA y T-test (</w:t>
+      </w:r>
+      <w:r>
+        <w:rPr>
+          <w:b/>
+          <w:bCs/>
+          <w:highlight w:val="yellow"/>
+          <w:highlightCs w:val="yellow"/>
+        </w:rPr>
+        <w:t xml:space="preserve">Felix</w:t>
+      </w:r>
+      <w:r>
+        <w:t xml:space="preserve">)</w:t>
       </w:r>
     </w:p>
     <w:p>
@@ -16112,7 +16340,19 @@
         <w:spacing w:after="100" w:before="160"/>
       </w:pPr>
       <w:r>
-        <w:t xml:space="preserve">3.1 Método</w:t>
+        <w:t xml:space="preserve">3.1 Método (</w:t>
+      </w:r>
+      <w:r>
+        <w:rPr>
+          <w:b/>
+          <w:bCs/>
+          <w:highlight w:val="yellow"/>
+          <w:highlightCs w:val="yellow"/>
+        </w:rPr>
+        <w:t xml:space="preserve">André</w:t>
+      </w:r>
+      <w:r>
+        <w:t xml:space="preserve">)</w:t>
       </w:r>
     </w:p>
     <w:p>
@@ -16197,7 +16437,19 @@
         <w:spacing w:after="100" w:before="160"/>
       </w:pPr>
       <w:r>
-        <w:t xml:space="preserve">3.2 Nivel Micro (Diario)</w:t>
+        <w:t xml:space="preserve">3.2 Nivel Micro (Diario) (</w:t>
+      </w:r>
+      <w:r>
+        <w:rPr>
+          <w:b/>
+          <w:bCs/>
+          <w:highlight w:val="yellow"/>
+          <w:highlightCs w:val="yellow"/>
+        </w:rPr>
+        <w:t xml:space="preserve">André</w:t>
+      </w:r>
+      <w:r>
+        <w:t xml:space="preserve">)</w:t>
       </w:r>
     </w:p>
     <w:p>
@@ -18339,7 +18591,19 @@
         <w:spacing w:after="100" w:before="160"/>
       </w:pPr>
       <w:r>
-        <w:t xml:space="preserve">3.3 Nivel Cliente (clientes únicos)</w:t>
+        <w:t xml:space="preserve">3.3 Nivel Cliente (clientes únicos) (</w:t>
+      </w:r>
+      <w:r>
+        <w:rPr>
+          <w:b/>
+          <w:bCs/>
+          <w:highlight w:val="yellow"/>
+          <w:highlightCs w:val="yellow"/>
+        </w:rPr>
+        <w:t xml:space="preserve">André</w:t>
+      </w:r>
+      <w:r>
+        <w:t xml:space="preserve">)</w:t>
       </w:r>
     </w:p>
     <w:p>
@@ -20640,7 +20904,19 @@
         <w:spacing w:after="100" w:before="160"/>
       </w:pPr>
       <w:r>
-        <w:t xml:space="preserve">3.4 Nivel Macro (Mensual)</w:t>
+        <w:t xml:space="preserve">3.4 Nivel Macro (Mensual) (</w:t>
+      </w:r>
+      <w:r>
+        <w:rPr>
+          <w:b/>
+          <w:bCs/>
+          <w:highlight w:val="yellow"/>
+          <w:highlightCs w:val="yellow"/>
+        </w:rPr>
+        <w:t xml:space="preserve">André</w:t>
+      </w:r>
+      <w:r>
+        <w:t xml:space="preserve">)</w:t>
       </w:r>
     </w:p>
     <w:p>
@@ -20667,7 +20943,19 @@
         <w:spacing w:after="100" w:before="160"/>
       </w:pPr>
       <w:r>
-        <w:t xml:space="preserve">3.5 Tablas de contingencia</w:t>
+        <w:t xml:space="preserve">3.5 Tablas de contingencia (</w:t>
+      </w:r>
+      <w:r>
+        <w:rPr>
+          <w:b/>
+          <w:bCs/>
+          <w:highlight w:val="yellow"/>
+          <w:highlightCs w:val="yellow"/>
+        </w:rPr>
+        <w:t xml:space="preserve">André</w:t>
+      </w:r>
+      <w:r>
+        <w:t xml:space="preserve">)</w:t>
       </w:r>
     </w:p>
     <w:p>
@@ -20862,7 +21150,19 @@
         <w:spacing w:after="100" w:before="160"/>
       </w:pPr>
       <w:r>
-        <w:t xml:space="preserve">3.6 Análisis de Chi-cuadrado</w:t>
+        <w:t xml:space="preserve">3.6 Análisis de Chi-cuadrado (</w:t>
+      </w:r>
+      <w:r>
+        <w:rPr>
+          <w:b/>
+          <w:bCs/>
+          <w:highlight w:val="yellow"/>
+          <w:highlightCs w:val="yellow"/>
+        </w:rPr>
+        <w:t xml:space="preserve">André</w:t>
+      </w:r>
+      <w:r>
+        <w:t xml:space="preserve">)</w:t>
       </w:r>
     </w:p>
     <w:p>

</xml_diff>

<commit_message>
Fix two statements in 4.3 report
Co-Authored-By: Claude Opus 5.5 <noreply@anthropic.com>
Claude-Session: https://claude.ai/code/session_01Kk2nfkPg9B6EJa48cu7SnH
</commit_message>
<xml_diff>
--- a/TI3002C_Etapa_4.3_6.docx
+++ b/TI3002C_Etapa_4.3_6.docx
@@ -16230,7 +16230,7 @@
         <w:t xml:space="preserve">Subcategoría y categoría</w:t>
       </w:r>
       <w:r>
-        <w:t xml:space="preserve"> explican principalmente el precio (η² = 0.598 y 0.239), no el cumplimiento ni la cobertura: el problema de inventario es más regional que de producto.</w:t>
+        <w:t xml:space="preserve"> explican principalmente el precio (η² = 0.598 y 0.271 en el Nivel Micro; 0.590 y 0.239 en el Macro), no el cumplimiento ni la cobertura: el problema de inventario es más regional que de producto.</w:t>
       </w:r>
     </w:p>
     <w:p>
@@ -21312,7 +21312,7 @@
         <w:t xml:space="preserve">Variables independientes:</w:t>
       </w:r>
       <w:r>
-        <w:t xml:space="preserve"> Gender, Geographic_Zone y Marital_Status no tienen relación con el nivel socioeconómico, la categoría del cliente, el uso de descuentos ni el canal (p &gt; 0.05 a nivel cliente).</w:t>
+        <w:t xml:space="preserve"> Gender y Geographic_Zone no tienen relación con el nivel socioeconómico, la categoría del cliente, el uso de descuentos ni el canal preferido (p &gt; 0.05 a nivel cliente). Marital_Status tampoco se relaciona con el nivel socioeconómico, la categoría ni el uso de descuentos, pero sí, de forma débil, con el canal preferido (V = 0.138).</w:t>
       </w:r>
     </w:p>
     <w:p>

</xml_diff>